<commit_message>
Moduli VV.F.: PIN 2.4 (dichiarazione impianto) dal modulo ufficiale vuoto
Co-Authored-By: Claude Sonnet 5.5 <noreply@anthropic.com>
</commit_message>
<xml_diff>
--- a/public/moduli/pin2-scia.docx
+++ b/public/moduli/pin2-scia.docx
@@ -5449,6 +5449,12 @@
                 <w:rFonts w:ascii="Times New Roman" w:hAnsi="Times New Roman"/>
               </w:rPr>
             </w:pPr>
+            <w:r>
+              <w:rPr>
+                <w:rFonts w:ascii="Times New Roman" w:hAnsi="Times New Roman"/>
+              </w:rPr>
+              <w:t xml:space="preserve">{{vaSotto0}}</w:t>
+            </w:r>
           </w:p>
         </w:tc>
         <w:tc>
@@ -6196,6 +6202,12 @@
                 <w:rFonts w:ascii="Times New Roman" w:hAnsi="Times New Roman"/>
               </w:rPr>
             </w:pPr>
+            <w:r>
+              <w:rPr>
+                <w:rFonts w:ascii="Times New Roman" w:hAnsi="Times New Roman"/>
+              </w:rPr>
+              <w:t xml:space="preserve">{{vaSotto1}}</w:t>
+            </w:r>
           </w:p>
         </w:tc>
         <w:tc>
@@ -6908,6 +6920,12 @@
                 <w:rFonts w:ascii="Times New Roman" w:hAnsi="Times New Roman"/>
               </w:rPr>
             </w:pPr>
+            <w:r>
+              <w:rPr>
+                <w:rFonts w:ascii="Times New Roman" w:hAnsi="Times New Roman"/>
+              </w:rPr>
+              <w:t xml:space="preserve">{{vaSotto2}}</w:t>
+            </w:r>
           </w:p>
         </w:tc>
         <w:tc>
@@ -7620,6 +7638,12 @@
                 <w:rFonts w:ascii="Times New Roman" w:hAnsi="Times New Roman"/>
               </w:rPr>
             </w:pPr>
+            <w:r>
+              <w:rPr>
+                <w:rFonts w:ascii="Times New Roman" w:hAnsi="Times New Roman"/>
+              </w:rPr>
+              <w:t xml:space="preserve">{{vaSotto3}}</w:t>
+            </w:r>
           </w:p>
         </w:tc>
         <w:tc>
@@ -8332,6 +8356,12 @@
                 <w:rFonts w:ascii="Times New Roman" w:hAnsi="Times New Roman"/>
               </w:rPr>
             </w:pPr>
+            <w:r>
+              <w:rPr>
+                <w:rFonts w:ascii="Times New Roman" w:hAnsi="Times New Roman"/>
+              </w:rPr>
+              <w:t xml:space="preserve">{{vaSotto4}}</w:t>
+            </w:r>
           </w:p>
         </w:tc>
         <w:tc>
@@ -9044,6 +9074,12 @@
                 <w:rFonts w:ascii="Times New Roman" w:hAnsi="Times New Roman"/>
               </w:rPr>
             </w:pPr>
+            <w:r>
+              <w:rPr>
+                <w:rFonts w:ascii="Times New Roman" w:hAnsi="Times New Roman"/>
+              </w:rPr>
+              <w:t xml:space="preserve">{{vaSotto5}}</w:t>
+            </w:r>
           </w:p>
         </w:tc>
         <w:tc>

</xml_diff>

<commit_message>
SCIA: data di firma nel PIN 2, sottoclasse del versamento, intervento e progetti approvati nel PIN 2.1
Co-Authored-By: Claude Sonnet 5.5 <noreply@anthropic.com>
</commit_message>
<xml_diff>
--- a/public/moduli/pin2-scia.docx
+++ b/public/moduli/pin2-scia.docx
@@ -10408,6 +10408,12 @@
             </w:pPr>
             <w:permStart w:id="1502770699" w:edGrp="everyone" w:colFirst="2" w:colLast="2"/>
             <w:permStart w:id="1566603504" w:edGrp="everyone" w:colFirst="0" w:colLast="0"/>
+            <w:r>
+              <w:rPr>
+                <w:sz w:val="20"/>
+              </w:rPr>
+              <w:t xml:space="preserve">{{dataFirma}}</w:t>
+            </w:r>
           </w:p>
         </w:tc>
         <w:tc>

</xml_diff>